<commit_message>
Update master CV: £30k/6-month figures, portfolio bullet, GitHub + website links
Co-Authored-By: Claude Opus 5.5 (1M context) <noreply@anthropic.com>
</commit_message>
<xml_diff>
--- a/cv/_PRATEEK CV_2026.docx
+++ b/cv/_PRATEEK CV_2026.docx
@@ -77,7 +77,35 @@
           <w:rPr>
             <w:rtl w:val="0"/>
           </w:rPr>
-          <w:t xml:space="preserve">www.linkedin.com</w:t>
+          <w:t xml:space="preserve">linkedin.com/in/prateek-sahni-meng</w:t>
+        </w:r>
+      </w:hyperlink>
+      <w:r>
+        <w:rPr>
+          <w:rtl w:val="0"/>
+        </w:rPr>
+        <w:t xml:space="preserve"> | </w:t>
+      </w:r>
+      <w:hyperlink r:id="rId9">
+        <w:r>
+          <w:rPr>
+            <w:rtl w:val="0"/>
+          </w:rPr>
+          <w:t xml:space="preserve">github.com/hksahni0-ux</w:t>
+        </w:r>
+      </w:hyperlink>
+      <w:r>
+        <w:rPr>
+          <w:rtl w:val="0"/>
+        </w:rPr>
+        <w:t xml:space="preserve"> | </w:t>
+      </w:r>
+      <w:hyperlink r:id="rId10">
+        <w:r>
+          <w:rPr>
+            <w:rtl w:val="0"/>
+          </w:rPr>
+          <w:t xml:space="preserve">prateeksahni.pages.dev</w:t>
         </w:r>
       </w:hyperlink>
       <w:r>
@@ -195,7 +223,7 @@
         <w:rPr>
           <w:rtl w:val="0"/>
         </w:rPr>
-        <w:t xml:space="preserve">Dynamic, results-oriented Engineering manager with 5+ years of experience bridging technical execution with strategic business growth. Currently driving high-impact process improvement, change management, and process automation initiatives, and successfully generated £15,000+ in less than three months time. Previously pioneered advanced research workflows by deploying Design of experiments, statistical process control, and Lean Six Sigma methodologies to optimize operational efficiency adhering to GMP guidelines and ISO 13485. </w:t>
+        <w:t xml:space="preserve">Dynamic, results-oriented Engineering manager with 5+ years of experience bridging technical execution with strategic business growth. Currently driving high-impact process improvement, change management, and process automation initiatives, and successfully generated £30,000+ in less than 6 months. Previously pioneered advanced research workflows by deploying Design of experiments, statistical process control, and Lean Six Sigma methodologies to optimize operational efficiency adhering to GMP guidelines and ISO 13485. </w:t>
       </w:r>
     </w:p>
     <w:p>
@@ -399,7 +427,7 @@
         <w:rPr>
           <w:rtl w:val="0"/>
         </w:rPr>
-        <w:t xml:space="preserve">Cut operational costs by £15k in 3 months using lean process development.</w:t>
+        <w:t>Cut operational costs by £30k in less than 6 months using lean process development.</w:t>
       </w:r>
     </w:p>
     <w:p>
@@ -455,6 +483,34 @@
     </w:p>
     <w:p>
       <w:pPr>
+        <w:numPr>
+          <w:ilvl w:val="0"/>
+          <w:numId w:val="1"/>
+        </w:numPr>
+        <w:tabs>
+          <w:tab w:val="left" w:leader="none" w:pos="395"/>
+        </w:tabs>
+        <w:spacing w:after="0" w:lineRule="auto"/>
+        <w:ind w:left="395" w:hanging="360"/>
+        <w:jc w:val="both"/>
+        <w:rPr>
+          <w:rFonts w:ascii="Calibri" w:cs="Calibri" w:eastAsia="Calibri" w:hAnsi="Calibri"/>
+        </w:rPr>
+      </w:pPr>
+      <w:r>
+        <w:rPr>
+          <w:rtl w:val="0"/>
+        </w:rPr>
+        <w:t>Built a personal portfolio site (prateeksahni.pages.dev) documenting 22 projects with outcomes and skills.</w:t>
+      </w:r>
+      <w:r>
+        <w:rPr>
+          <w:rtl w:val="0"/>
+        </w:rPr>
+      </w:r>
+    </w:p>
+    <w:p>
+      <w:pPr>
         <w:tabs>
           <w:tab w:val="left" w:leader="none" w:pos="395"/>
         </w:tabs>
@@ -462,8 +518,8 @@
         <w:ind w:left="395" w:firstLine="0"/>
         <w:jc w:val="both"/>
         <w:rPr>
-          <w:sz w:val="20"/>
-          <w:szCs w:val="20"/>
+          <w:sz w:val="14"/>
+          <w:szCs w:val="14"/>
         </w:rPr>
       </w:pPr>
       <w:r>
@@ -673,8 +729,8 @@
         <w:spacing w:after="0" w:before="0" w:lineRule="auto"/>
         <w:ind w:left="0" w:firstLine="0"/>
         <w:rPr>
-          <w:sz w:val="20"/>
-          <w:szCs w:val="20"/>
+          <w:sz w:val="14"/>
+          <w:szCs w:val="14"/>
         </w:rPr>
       </w:pPr>
       <w:r>
@@ -880,8 +936,8 @@
           <w:smallCaps w:val="0"/>
           <w:strike w:val="0"/>
           <w:color w:val="000000"/>
-          <w:sz w:val="20"/>
-          <w:szCs w:val="20"/>
+          <w:sz w:val="14"/>
+          <w:szCs w:val="14"/>
           <w:u w:val="none"/>
           <w:shd w:fill="auto" w:val="clear"/>
           <w:vertAlign w:val="baseline"/>
@@ -1038,8 +1094,8 @@
           <w:smallCaps w:val="0"/>
           <w:strike w:val="0"/>
           <w:color w:val="000000"/>
-          <w:sz w:val="20"/>
-          <w:szCs w:val="20"/>
+          <w:sz w:val="14"/>
+          <w:szCs w:val="14"/>
           <w:u w:val="none"/>
           <w:shd w:fill="auto" w:val="clear"/>
           <w:vertAlign w:val="baseline"/>

</xml_diff>